<commit_message>
nmcca opening-brief: Times New Roman per NMCCA Rule 17(c), which bars Courier and non-proportional type; the rule overrides the Courier New exemplar. typst ("Times New Roman", "Liberation Serif") and docx Times New Roman; rules.md cites Rule 17(c) (URL, SHA-256, verified 2026-10-22); data/exemplar-fonts.json entry face Times New Roman with an override note; SOURCE.md corrects the exemplar face (Courier New, not Times New Roman); note-clearance 9.8 pt so clearance + gap equal LibreOffice's 16.8 pt separator line (XENG-002/003 had failed on pp. 11-12); docx no-break space 70 twips; re-rendered 13 pages, check.sh typst 8/0 and docx 12/0 with XENG-001..003 and DEF-COVER-001 pass; every page reviewed (fb-595.74)
</commit_message>
<xml_diff>
--- a/courts/military/navy-marine-corps-court-of-criminal-appeals/opening-brief/usage/OUTPUT-opening-brief.docx
+++ b/courts/military/navy-marine-corps-court-of-criminal-appeals/opening-brief/usage/OUTPUT-opening-brief.docx
@@ -744,7 +744,7 @@
       </w:r>
       <w:r>
         <w:rPr>
-          <w:spacing w:val="42"/>
+          <w:spacing w:val="140"/>
         </w:rPr>
         <w:t xml:space="preserve"> </w:t>
       </w:r>
@@ -787,7 +787,7 @@
       </w:r>
       <w:r>
         <w:rPr>
-          <w:spacing w:val="42"/>
+          <w:spacing w:val="140"/>
         </w:rPr>
         <w:t xml:space="preserve"> </w:t>
       </w:r>
@@ -830,7 +830,7 @@
       </w:r>
       <w:r>
         <w:rPr>
-          <w:spacing w:val="42"/>
+          <w:spacing w:val="140"/>
         </w:rPr>
         <w:t xml:space="preserve"> </w:t>
       </w:r>
@@ -867,7 +867,7 @@
       </w:r>
       <w:r>
         <w:rPr>
-          <w:spacing w:val="42"/>
+          <w:spacing w:val="140"/>
         </w:rPr>
         <w:t xml:space="preserve"> </w:t>
       </w:r>
@@ -904,7 +904,7 @@
       </w:r>
       <w:r>
         <w:rPr>
-          <w:spacing w:val="42"/>
+          <w:spacing w:val="140"/>
         </w:rPr>
         <w:t xml:space="preserve"> </w:t>
       </w:r>
@@ -912,7 +912,7 @@
         <w:tab/>
       </w:r>
       <w:r>
-        <w:t xml:space="preserve">7</w:t>
+        <w:t xml:space="preserve">5</w:t>
       </w:r>
     </w:p>
     <w:p>
@@ -929,7 +929,7 @@
       </w:r>
       <w:r>
         <w:rPr>
-          <w:spacing w:val="42"/>
+          <w:spacing w:val="140"/>
         </w:rPr>
         <w:t xml:space="preserve"> </w:t>
       </w:r>
@@ -937,7 +937,7 @@
         <w:tab/>
       </w:r>
       <w:r>
-        <w:t xml:space="preserve">9</w:t>
+        <w:t xml:space="preserve">7</w:t>
       </w:r>
     </w:p>
     <w:p>
@@ -1020,7 +1020,7 @@
       </w:r>
       <w:r>
         <w:rPr>
-          <w:spacing w:val="42"/>
+          <w:spacing w:val="140"/>
         </w:rPr>
         <w:t xml:space="preserve"> </w:t>
       </w:r>
@@ -1028,7 +1028,7 @@
         <w:tab/>
       </w:r>
       <w:r>
-        <w:t xml:space="preserve">9</w:t>
+        <w:t xml:space="preserve">7</w:t>
       </w:r>
     </w:p>
     <w:p>
@@ -1045,7 +1045,7 @@
       </w:r>
       <w:r>
         <w:rPr>
-          <w:spacing w:val="42"/>
+          <w:spacing w:val="140"/>
         </w:rPr>
         <w:t xml:space="preserve"> </w:t>
       </w:r>
@@ -1053,7 +1053,7 @@
         <w:tab/>
       </w:r>
       <w:r>
-        <w:t xml:space="preserve">13</w:t>
+        <w:t xml:space="preserve">10</w:t>
       </w:r>
     </w:p>
     <w:p>
@@ -4611,7 +4611,7 @@
   <w:docDefaults>
     <w:rPrDefault>
       <w:rPr>
-        <w:rFonts w:ascii="Liberation Mono" w:hAnsi="Liberation Mono" w:eastAsia="Liberation Mono" w:cs="Liberation Mono"/>
+        <w:rFonts w:ascii="Times New Roman" w:hAnsi="Times New Roman" w:eastAsia="Times New Roman" w:cs="Times New Roman"/>
         <w:sz w:val="28"/>
         <w:szCs w:val="28"/>
         <w:lang w:val="en-US" w:eastAsia="en-US" w:bidi="ar-SA"/>
@@ -4633,7 +4633,7 @@
       <w:spacing w:before="0" w:after="0" w:line="336" w:lineRule="exact"/>
     </w:pPr>
     <w:rPr>
-      <w:rFonts w:ascii="Liberation Mono" w:hAnsi="Liberation Mono" w:eastAsia="Liberation Mono" w:cs="Liberation Mono"/>
+      <w:rFonts w:ascii="Times New Roman" w:hAnsi="Times New Roman" w:eastAsia="Times New Roman" w:cs="Times New Roman"/>
       <w:sz w:val="28"/>
       <w:szCs w:val="28"/>
     </w:rPr>
@@ -5532,7 +5532,7 @@
     </a:clrScheme>
     <a:fontScheme name="Office">
       <a:majorFont>
-        <a:latin typeface="Liberation Mono" panose="02110004020202020204"/>
+        <a:latin typeface="Times New Roman" panose="02110004020202020204"/>
         <a:ea typeface=""/>
         <a:cs typeface=""/>
         <a:font script="Jpan" typeface="游ゴシック Light"/>
@@ -5584,7 +5584,7 @@
         <a:font script="Tfng" typeface="Ebrima"/>
       </a:majorFont>
       <a:minorFont>
-        <a:latin typeface="Liberation Mono" panose="02110004020202020204"/>
+        <a:latin typeface="Times New Roman" panose="02110004020202020204"/>
         <a:ea typeface=""/>
         <a:cs typeface=""/>
         <a:font script="Jpan" typeface="游明朝"/>

</xml_diff>